<commit_message>
Make arrow not split lines
</commit_message>
<xml_diff>
--- a/ZC4H2 Unravel overlap 4s 5s.docx
+++ b/ZC4H2 Unravel overlap 4s 5s.docx
@@ -958,7 +958,7 @@
                 <w:rFonts w:ascii="Calibri" w:hAnsi="Calibri"/>
                 <w:sz w:val="20"/>
               </w:rPr>
-              <w:t xml:space="preserve">Neurotransmitter modulator, ↑ ZC4H2</w:t>
+              <w:t xml:space="preserve">↑ ZC4H2, Neurotransmitter modulator</w:t>
             </w:r>
           </w:p>
         </w:tc>
@@ -1698,7 +1698,7 @@
                 <w:rFonts w:ascii="Calibri" w:hAnsi="Calibri"/>
                 <w:sz w:val="20"/>
               </w:rPr>
-              <w:t xml:space="preserve">Neurotransmitter modulator, ↑ ZC4H2</w:t>
+              <w:t xml:space="preserve">↑ ZC4H2, Neurotransmitter modulator</w:t>
             </w:r>
           </w:p>
         </w:tc>
@@ -1851,7 +1851,7 @@
                 <w:rFonts w:ascii="Calibri" w:hAnsi="Calibri"/>
                 <w:sz w:val="20"/>
               </w:rPr>
-              <w:t xml:space="preserve">Neurotransmitter modulator, ↑ ZC4H2</w:t>
+              <w:t xml:space="preserve">↑ ZC4H2, Neurotransmitter modulator</w:t>
             </w:r>
           </w:p>
         </w:tc>
@@ -2005,7 +2005,7 @@
                 <w:rFonts w:ascii="Calibri" w:hAnsi="Calibri"/>
                 <w:sz w:val="20"/>
               </w:rPr>
-              <w:t xml:space="preserve">Neurotransmitter modulator, ↑ ZC4H2</w:t>
+              <w:t xml:space="preserve">↑ ZC4H2, Neurotransmitter modulator</w:t>
             </w:r>
           </w:p>
         </w:tc>
@@ -2577,7 +2577,7 @@
                 <w:rFonts w:ascii="Calibri" w:hAnsi="Calibri"/>
                 <w:sz w:val="20"/>
               </w:rPr>
-              <w:t xml:space="preserve">Neurotransmitter modulator, Symptomatic relief</w:t>
+              <w:t xml:space="preserve">Symptomatic relief, Neurotransmitter modulator</w:t>
             </w:r>
           </w:p>
         </w:tc>
@@ -3539,7 +3539,7 @@
                 <w:rFonts w:ascii="Calibri" w:hAnsi="Calibri"/>
                 <w:sz w:val="20"/>
               </w:rPr>
-              <w:t xml:space="preserve">Neurotransmitter modulator, ↑ ZC4H2</w:t>
+              <w:t xml:space="preserve">↑ ZC4H2, Neurotransmitter modulator</w:t>
             </w:r>
           </w:p>
         </w:tc>
@@ -4362,7 +4362,7 @@
                 <w:rFonts w:ascii="Calibri" w:hAnsi="Calibri"/>
                 <w:sz w:val="20"/>
               </w:rPr>
-              <w:t xml:space="preserve">Increase neuroplasticity, Increase dendritic spine density, ↑ ZC4H2</w:t>
+              <w:t xml:space="preserve">↑ ZC4H2, Increase neuroplasticity, Increase dendritic spine density</w:t>
             </w:r>
           </w:p>
         </w:tc>

</xml_diff>